<commit_message>
New Ashvardh photo, centre Chaarika's face, Raeed quote wording, full Athleticum/SPARC brief rewrite
Co-Authored-By: Claude Fable 5 <noreply@anthropic.com>
</commit_message>
<xml_diff>
--- a/STUFF/Quotes.docx
+++ b/STUFF/Quotes.docx
@@ -59,7 +59,13 @@
     </w:p>
     <w:p>
       <w:r>
-        <w:t xml:space="preserve">“Ideas are forms of conformism; don’t come here with an idea.” </w:t>
+        <w:t>“Ideas are forms of conformi</w:t>
+      </w:r>
+      <w:r>
+        <w:t>ty</w:t>
+      </w:r>
+      <w:r>
+        <w:t xml:space="preserve">; don’t come here with an idea.” </w:t>
       </w:r>
     </w:p>
     <w:p/>

</xml_diff>